<commit_message>
Agrega servidor Flask para consultar inventario de dispositivos
</commit_message>
<xml_diff>
--- a/Práctica_30_Septiembre.docx
+++ b/Práctica_30_Septiembre.docx
@@ -171,15 +171,7 @@
                 <w:b/>
                 <w:bCs/>
               </w:rPr>
-              <w:t>POST</w:t>
-            </w:r>
-            <w:r>
-              <w:rPr>
-                <w:rFonts w:ascii="Arial" w:hAnsi="Arial" w:cs="Arial"/>
-                <w:b/>
-                <w:bCs/>
-              </w:rPr>
-              <w:t xml:space="preserve">; </w:t>
+              <w:t xml:space="preserve">POST; </w:t>
             </w:r>
             <w:r>
               <w:rPr>
@@ -241,15 +233,7 @@
                 <w:b/>
                 <w:bCs/>
               </w:rPr>
-              <w:t>PUT</w:t>
-            </w:r>
-            <w:r>
-              <w:rPr>
-                <w:rFonts w:ascii="Arial" w:hAnsi="Arial" w:cs="Arial"/>
-                <w:b/>
-                <w:bCs/>
-              </w:rPr>
-              <w:t xml:space="preserve">; </w:t>
+              <w:t xml:space="preserve">PUT; </w:t>
             </w:r>
             <w:r>
               <w:rPr>
@@ -311,15 +295,7 @@
                 <w:b/>
                 <w:bCs/>
               </w:rPr>
-              <w:t>DELETE</w:t>
-            </w:r>
-            <w:r>
-              <w:rPr>
-                <w:rFonts w:ascii="Arial" w:hAnsi="Arial" w:cs="Arial"/>
-                <w:b/>
-                <w:bCs/>
-              </w:rPr>
-              <w:t xml:space="preserve">; </w:t>
+              <w:t xml:space="preserve">DELETE; </w:t>
             </w:r>
             <w:r>
               <w:rPr>
@@ -605,23 +581,7 @@
           <w:b/>
           <w:bCs/>
         </w:rPr>
-        <w:t>2. Se envía una petición POST para configurar un nuevo túnel VPN, pero el token de autenticación</w:t>
-      </w:r>
-      <w:r>
-        <w:rPr>
-          <w:rFonts w:ascii="Arial" w:hAnsi="Arial" w:cs="Arial"/>
-          <w:b/>
-          <w:bCs/>
-        </w:rPr>
-        <w:t xml:space="preserve"> </w:t>
-      </w:r>
-      <w:r>
-        <w:rPr>
-          <w:rFonts w:ascii="Arial" w:hAnsi="Arial" w:cs="Arial"/>
-          <w:b/>
-          <w:bCs/>
-        </w:rPr>
-        <w:t xml:space="preserve">en el encabezado </w:t>
+        <w:t xml:space="preserve">2. Se envía una petición POST para configurar un nuevo túnel VPN, pero el token de autenticación en el encabezado </w:t>
       </w:r>
       <w:proofErr w:type="spellStart"/>
       <w:r>
@@ -754,23 +714,7 @@
           <w:b/>
           <w:bCs/>
         </w:rPr>
-        <w:t xml:space="preserve"> La</w:t>
-      </w:r>
-      <w:r>
-        <w:rPr>
-          <w:rFonts w:ascii="Arial" w:hAnsi="Arial" w:cs="Arial"/>
-          <w:b/>
-          <w:bCs/>
-        </w:rPr>
-        <w:t xml:space="preserve"> </w:t>
-      </w:r>
-      <w:r>
-        <w:rPr>
-          <w:rFonts w:ascii="Arial" w:hAnsi="Arial" w:cs="Arial"/>
-          <w:b/>
-          <w:bCs/>
-        </w:rPr>
-        <w:t xml:space="preserve">API responde con un código 400 Bad </w:t>
+        <w:t xml:space="preserve"> La API responde con un código 400 Bad </w:t>
       </w:r>
       <w:proofErr w:type="spellStart"/>
       <w:r>
@@ -788,23 +732,7 @@
           <w:b/>
           <w:bCs/>
         </w:rPr>
-        <w:t>. Explica dos posibles razones técnicas</w:t>
-      </w:r>
-      <w:r>
-        <w:rPr>
-          <w:rFonts w:ascii="Arial" w:hAnsi="Arial" w:cs="Arial"/>
-          <w:b/>
-          <w:bCs/>
-        </w:rPr>
-        <w:t xml:space="preserve"> </w:t>
-      </w:r>
-      <w:r>
-        <w:rPr>
-          <w:rFonts w:ascii="Arial" w:hAnsi="Arial" w:cs="Arial"/>
-          <w:b/>
-          <w:bCs/>
-        </w:rPr>
-        <w:t>relacionadas con la estructura de la petición (</w:t>
+        <w:t>. Explica dos posibles razones técnicas relacionadas con la estructura de la petición (</w:t>
       </w:r>
       <w:proofErr w:type="spellStart"/>
       <w:r>
@@ -822,15 +750,7 @@
           <w:b/>
           <w:bCs/>
         </w:rPr>
-        <w:t>) que podrían causar este error específico</w:t>
-      </w:r>
-      <w:r>
-        <w:rPr>
-          <w:rFonts w:ascii="Arial" w:hAnsi="Arial" w:cs="Arial"/>
-          <w:b/>
-          <w:bCs/>
-        </w:rPr>
-        <w:t>:</w:t>
+        <w:t>) que podrían causar este error específico:</w:t>
       </w:r>
     </w:p>
     <w:p>
@@ -905,31 +825,7 @@
         <w:rPr>
           <w:rFonts w:ascii="Arial" w:hAnsi="Arial" w:cs="Arial"/>
         </w:rPr>
-        <w:t xml:space="preserve"> (</w:t>
-      </w:r>
-      <w:r>
-        <w:rPr>
-          <w:rFonts w:ascii="Arial" w:hAnsi="Arial" w:cs="Arial"/>
-        </w:rPr>
-        <w:t>contiene una dirección IP que no sigue el formato estándar IPv4</w:t>
-      </w:r>
-      <w:r>
-        <w:rPr>
-          <w:rFonts w:ascii="Arial" w:hAnsi="Arial" w:cs="Arial"/>
-        </w:rPr>
-        <w:t>) y la sintaxis JSON incorrecta en el cuerpo de la petición (</w:t>
-      </w:r>
-      <w:r>
-        <w:rPr>
-          <w:rFonts w:ascii="Arial" w:hAnsi="Arial" w:cs="Arial"/>
-        </w:rPr>
-        <w:t>Hay errores de sintaxis en el JSON enviado, como una coma faltante entre pares clave-valor, comillas dobles faltantes en las claves o valores, o una coma final</w:t>
-      </w:r>
-      <w:r>
-        <w:rPr>
-          <w:rFonts w:ascii="Arial" w:hAnsi="Arial" w:cs="Arial"/>
-        </w:rPr>
-        <w:t>).</w:t>
+        <w:t xml:space="preserve"> (contiene una dirección IP que no sigue el formato estándar IPv4) y la sintaxis JSON incorrecta en el cuerpo de la petición (Hay errores de sintaxis en el JSON enviado, como una coma faltante entre pares clave-valor, comillas dobles faltantes en las claves o valores, o una coma final).</w:t>
       </w:r>
     </w:p>
     <w:p>
@@ -955,15 +851,7 @@
           <w:b/>
           <w:bCs/>
         </w:rPr>
-        <w:t>4. ¿Cuál es la diferencia principal entre el uso de POST y PUT al configurar una interfaz de red, considerando la propiedad de idempotencia?</w:t>
-      </w:r>
-      <w:r>
-        <w:rPr>
-          <w:rFonts w:ascii="Arial" w:hAnsi="Arial" w:cs="Arial"/>
-          <w:b/>
-          <w:bCs/>
-        </w:rPr>
-        <w:t xml:space="preserve">  </w:t>
+        <w:t xml:space="preserve">4. ¿Cuál es la diferencia principal entre el uso de POST y PUT al configurar una interfaz de red, considerando la propiedad de idempotencia?  </w:t>
       </w:r>
     </w:p>
     <w:p>
@@ -976,14 +864,71 @@
       <w:r>
         <w:rPr>
           <w:rFonts w:ascii="Arial" w:hAnsi="Arial" w:cs="Arial"/>
-        </w:rPr>
-        <w:t>Se u</w:t>
-      </w:r>
-      <w:r>
-        <w:rPr>
-          <w:rFonts w:ascii="Arial" w:hAnsi="Arial" w:cs="Arial"/>
-        </w:rPr>
-        <w:t xml:space="preserve">sa </w:t>
+          <w:noProof/>
+        </w:rPr>
+        <w:drawing>
+          <wp:anchor distT="0" distB="0" distL="114300" distR="114300" simplePos="0" relativeHeight="251658240" behindDoc="0" locked="0" layoutInCell="1" allowOverlap="1" wp14:anchorId="33FF21F2" wp14:editId="47B0E578">
+            <wp:simplePos x="0" y="0"/>
+            <wp:positionH relativeFrom="margin">
+              <wp:align>left</wp:align>
+            </wp:positionH>
+            <wp:positionV relativeFrom="paragraph">
+              <wp:posOffset>563552</wp:posOffset>
+            </wp:positionV>
+            <wp:extent cx="5612130" cy="3134995"/>
+            <wp:effectExtent l="0" t="0" r="7620" b="8255"/>
+            <wp:wrapThrough wrapText="bothSides">
+              <wp:wrapPolygon edited="0">
+                <wp:start x="0" y="0"/>
+                <wp:lineTo x="0" y="21526"/>
+                <wp:lineTo x="21556" y="21526"/>
+                <wp:lineTo x="21556" y="0"/>
+                <wp:lineTo x="0" y="0"/>
+              </wp:wrapPolygon>
+            </wp:wrapThrough>
+            <wp:docPr id="1393379133" name="Imagen 1"/>
+            <wp:cNvGraphicFramePr>
+              <a:graphicFrameLocks xmlns:a="http://schemas.openxmlformats.org/drawingml/2006/main" noChangeAspect="1"/>
+            </wp:cNvGraphicFramePr>
+            <a:graphic xmlns:a="http://schemas.openxmlformats.org/drawingml/2006/main">
+              <a:graphicData uri="http://schemas.openxmlformats.org/drawingml/2006/picture">
+                <pic:pic xmlns:pic="http://schemas.openxmlformats.org/drawingml/2006/picture">
+                  <pic:nvPicPr>
+                    <pic:cNvPr id="1393379133" name=""/>
+                    <pic:cNvPicPr/>
+                  </pic:nvPicPr>
+                  <pic:blipFill>
+                    <a:blip r:embed="rId5">
+                      <a:extLst>
+                        <a:ext uri="{28A0092B-C50C-407E-A947-70E740481C1C}">
+                          <a14:useLocalDpi xmlns:a14="http://schemas.microsoft.com/office/drawing/2010/main" val="0"/>
+                        </a:ext>
+                      </a:extLst>
+                    </a:blip>
+                    <a:stretch>
+                      <a:fillRect/>
+                    </a:stretch>
+                  </pic:blipFill>
+                  <pic:spPr>
+                    <a:xfrm>
+                      <a:off x="0" y="0"/>
+                      <a:ext cx="5612130" cy="3134995"/>
+                    </a:xfrm>
+                    <a:prstGeom prst="rect">
+                      <a:avLst/>
+                    </a:prstGeom>
+                  </pic:spPr>
+                </pic:pic>
+              </a:graphicData>
+            </a:graphic>
+          </wp:anchor>
+        </w:drawing>
+      </w:r>
+      <w:r>
+        <w:rPr>
+          <w:rFonts w:ascii="Arial" w:hAnsi="Arial" w:cs="Arial"/>
+        </w:rPr>
+        <w:t xml:space="preserve">Se usa </w:t>
       </w:r>
       <w:r>
         <w:rPr>
@@ -997,19 +942,7 @@
         <w:rPr>
           <w:rFonts w:ascii="Arial" w:hAnsi="Arial" w:cs="Arial"/>
         </w:rPr>
-        <w:t xml:space="preserve"> cuando quieras </w:t>
-      </w:r>
-      <w:r>
-        <w:rPr>
-          <w:rFonts w:ascii="Arial" w:hAnsi="Arial" w:cs="Arial"/>
-        </w:rPr>
-        <w:t xml:space="preserve">tipo; </w:t>
-      </w:r>
-      <w:r>
-        <w:rPr>
-          <w:rFonts w:ascii="Arial" w:hAnsi="Arial" w:cs="Arial"/>
-        </w:rPr>
-        <w:t xml:space="preserve">establecer/actualizar un estado conocido, y </w:t>
+        <w:t xml:space="preserve"> cuando quieras tipo; establecer/actualizar un estado conocido, y </w:t>
       </w:r>
       <w:r>
         <w:rPr>
@@ -1033,6 +966,137 @@
           <w:rFonts w:ascii="Arial" w:hAnsi="Arial" w:cs="Arial"/>
         </w:rPr>
       </w:pPr>
+      <w:r>
+        <w:rPr>
+          <w:rFonts w:ascii="Arial" w:hAnsi="Arial" w:cs="Arial"/>
+        </w:rPr>
+        <w:drawing>
+          <wp:anchor distT="0" distB="0" distL="114300" distR="114300" simplePos="0" relativeHeight="251660288" behindDoc="0" locked="0" layoutInCell="1" allowOverlap="1" wp14:anchorId="1AA44AED" wp14:editId="2FED1220">
+            <wp:simplePos x="0" y="0"/>
+            <wp:positionH relativeFrom="margin">
+              <wp:align>left</wp:align>
+            </wp:positionH>
+            <wp:positionV relativeFrom="paragraph">
+              <wp:posOffset>3566774</wp:posOffset>
+            </wp:positionV>
+            <wp:extent cx="5612130" cy="3169285"/>
+            <wp:effectExtent l="0" t="0" r="7620" b="0"/>
+            <wp:wrapThrough wrapText="bothSides">
+              <wp:wrapPolygon edited="0">
+                <wp:start x="0" y="0"/>
+                <wp:lineTo x="0" y="21423"/>
+                <wp:lineTo x="21556" y="21423"/>
+                <wp:lineTo x="21556" y="0"/>
+                <wp:lineTo x="0" y="0"/>
+              </wp:wrapPolygon>
+            </wp:wrapThrough>
+            <wp:docPr id="360762004" name="Imagen 1"/>
+            <wp:cNvGraphicFramePr>
+              <a:graphicFrameLocks xmlns:a="http://schemas.openxmlformats.org/drawingml/2006/main" noChangeAspect="1"/>
+            </wp:cNvGraphicFramePr>
+            <a:graphic xmlns:a="http://schemas.openxmlformats.org/drawingml/2006/main">
+              <a:graphicData uri="http://schemas.openxmlformats.org/drawingml/2006/picture">
+                <pic:pic xmlns:pic="http://schemas.openxmlformats.org/drawingml/2006/picture">
+                  <pic:nvPicPr>
+                    <pic:cNvPr id="360762004" name=""/>
+                    <pic:cNvPicPr/>
+                  </pic:nvPicPr>
+                  <pic:blipFill>
+                    <a:blip r:embed="rId6">
+                      <a:extLst>
+                        <a:ext uri="{28A0092B-C50C-407E-A947-70E740481C1C}">
+                          <a14:useLocalDpi xmlns:a14="http://schemas.microsoft.com/office/drawing/2010/main" val="0"/>
+                        </a:ext>
+                      </a:extLst>
+                    </a:blip>
+                    <a:stretch>
+                      <a:fillRect/>
+                    </a:stretch>
+                  </pic:blipFill>
+                  <pic:spPr>
+                    <a:xfrm>
+                      <a:off x="0" y="0"/>
+                      <a:ext cx="5612130" cy="3169285"/>
+                    </a:xfrm>
+                    <a:prstGeom prst="rect">
+                      <a:avLst/>
+                    </a:prstGeom>
+                  </pic:spPr>
+                </pic:pic>
+              </a:graphicData>
+            </a:graphic>
+          </wp:anchor>
+        </w:drawing>
+      </w:r>
+      <w:r>
+        <w:rPr>
+          <w:rFonts w:ascii="Arial" w:hAnsi="Arial" w:cs="Arial"/>
+        </w:rPr>
+        <w:t xml:space="preserve"> </w:t>
+      </w:r>
+      <w:r>
+        <w:rPr>
+          <w:rFonts w:ascii="Arial" w:hAnsi="Arial" w:cs="Arial"/>
+          <w:noProof/>
+        </w:rPr>
+        <w:drawing>
+          <wp:anchor distT="0" distB="0" distL="114300" distR="114300" simplePos="0" relativeHeight="251659264" behindDoc="0" locked="0" layoutInCell="1" allowOverlap="1" wp14:anchorId="61428039" wp14:editId="61254AFC">
+            <wp:simplePos x="0" y="0"/>
+            <wp:positionH relativeFrom="column">
+              <wp:posOffset>2431</wp:posOffset>
+            </wp:positionH>
+            <wp:positionV relativeFrom="paragraph">
+              <wp:posOffset>4095</wp:posOffset>
+            </wp:positionV>
+            <wp:extent cx="5612130" cy="3184525"/>
+            <wp:effectExtent l="0" t="0" r="7620" b="0"/>
+            <wp:wrapThrough wrapText="bothSides">
+              <wp:wrapPolygon edited="0">
+                <wp:start x="0" y="0"/>
+                <wp:lineTo x="0" y="21449"/>
+                <wp:lineTo x="21556" y="21449"/>
+                <wp:lineTo x="21556" y="0"/>
+                <wp:lineTo x="0" y="0"/>
+              </wp:wrapPolygon>
+            </wp:wrapThrough>
+            <wp:docPr id="1440042716" name="Imagen 1"/>
+            <wp:cNvGraphicFramePr>
+              <a:graphicFrameLocks xmlns:a="http://schemas.openxmlformats.org/drawingml/2006/main" noChangeAspect="1"/>
+            </wp:cNvGraphicFramePr>
+            <a:graphic xmlns:a="http://schemas.openxmlformats.org/drawingml/2006/main">
+              <a:graphicData uri="http://schemas.openxmlformats.org/drawingml/2006/picture">
+                <pic:pic xmlns:pic="http://schemas.openxmlformats.org/drawingml/2006/picture">
+                  <pic:nvPicPr>
+                    <pic:cNvPr id="1440042716" name=""/>
+                    <pic:cNvPicPr/>
+                  </pic:nvPicPr>
+                  <pic:blipFill>
+                    <a:blip r:embed="rId7">
+                      <a:extLst>
+                        <a:ext uri="{28A0092B-C50C-407E-A947-70E740481C1C}">
+                          <a14:useLocalDpi xmlns:a14="http://schemas.microsoft.com/office/drawing/2010/main" val="0"/>
+                        </a:ext>
+                      </a:extLst>
+                    </a:blip>
+                    <a:stretch>
+                      <a:fillRect/>
+                    </a:stretch>
+                  </pic:blipFill>
+                  <pic:spPr>
+                    <a:xfrm>
+                      <a:off x="0" y="0"/>
+                      <a:ext cx="5612130" cy="3184525"/>
+                    </a:xfrm>
+                    <a:prstGeom prst="rect">
+                      <a:avLst/>
+                    </a:prstGeom>
+                  </pic:spPr>
+                </pic:pic>
+              </a:graphicData>
+            </a:graphic>
+          </wp:anchor>
+        </w:drawing>
+      </w:r>
     </w:p>
     <w:sectPr>
       <w:pgSz w:w="12240" w:h="15840"/>
@@ -1920,6 +1984,7 @@
   <w:style w:type="character" w:default="1" w:styleId="Fuentedeprrafopredeter">
     <w:name w:val="Default Paragraph Font"/>
     <w:uiPriority w:val="1"/>
+    <w:semiHidden/>
     <w:unhideWhenUsed/>
   </w:style>
   <w:style w:type="table" w:default="1" w:styleId="Tablanormal">

</xml_diff>